<commit_message>
report: simplify case wording and reserve MagicBokeh VEPI row
</commit_message>
<xml_diff>
--- a/汇报/2026-10-16_基线更新与ATB分析/基线更新与ATB分析_1016_讲稿.docx
+++ b/汇报/2026-10-16_基线更新与ATB分析/基线更新与ATB分析_1016_讲稿.docx
@@ -44,87 +44,7 @@
         <w:spacing w:before="200" w:after="160"/>
       </w:pPr>
       <w:r>
-        <w:rPr>
-          <w:sz w:val="30"/>
-        </w:rPr>
-        <w:t>第2页  主体保留与背景虚化</w:t>
-      </w:r>
-    </w:p>
-    <w:p>
-      <w:pPr>
-        <w:spacing w:line="324" w:lineRule="auto" w:after="140"/>
-      </w:pPr>
-      <w:r>
-        <w:rPr>
-          <w:rFonts w:ascii="Microsoft YaHei" w:hAnsi="Microsoft YaHei" w:eastAsia="微软雅黑"/>
-          <w:sz w:val="22"/>
-        </w:rPr>
-        <w:t>上方是作者项目页的山羊演示，下方是我们用官方权重在DAVIS黑天鹅片段上的复现。左侧为输入，右侧为输出。播放时重点看主体轮廓、细节和背景纹理的变化。</w:t>
-      </w:r>
-    </w:p>
-    <w:p>
-      <w:pPr>
-        <w:spacing w:line="324" w:lineRule="auto" w:after="140"/>
-      </w:pPr>
-      <w:r>
-        <w:rPr>
-          <w:rFonts w:ascii="Microsoft YaHei" w:hAnsi="Microsoft YaHei" w:eastAsia="微软雅黑"/>
-          <w:sz w:val="22"/>
-        </w:rPr>
-        <w:t>官方素材用于展示方法能力，本地素材用于展示实际复现。黑天鹅使用固定K=16，共25帧，20fps循环播放。两行采用不同素材，讨论各自的视觉现象。官方视频来源为vivocameraresearch.github.io/any2bokeh。</w:t>
-      </w:r>
-    </w:p>
-    <w:p>
-      <w:r>
-        <w:br w:type="page"/>
-      </w:r>
-    </w:p>
-    <w:p>
-      <w:pPr>
-        <w:pStyle w:val="1"/>
-        <w:spacing w:before="200" w:after="160"/>
-      </w:pPr>
-      <w:r>
-        <w:rPr>
-          <w:sz w:val="30"/>
-        </w:rPr>
-        <w:t>第3页  运动场景下的视频虚化</w:t>
-      </w:r>
-    </w:p>
-    <w:p>
-      <w:pPr>
-        <w:spacing w:line="324" w:lineRule="auto" w:after="140"/>
-      </w:pPr>
-      <w:r>
-        <w:rPr>
-          <w:rFonts w:ascii="Microsoft YaHei" w:hAnsi="Microsoft YaHei" w:eastAsia="微软雅黑"/>
-          <w:sz w:val="22"/>
-        </w:rPr>
-        <w:t>上方是作者舞蹈演示，下方是本地DAVIS街舞复现。观察人物运动过程中手臂、腿部和背景交界处的变化，理解视频虚化需要同时处理空间边界和连续帧关系。</w:t>
-      </w:r>
-    </w:p>
-    <w:p>
-      <w:pPr>
-        <w:spacing w:line="324" w:lineRule="auto" w:after="140"/>
-      </w:pPr>
-      <w:r>
-        <w:rPr>
-          <w:rFonts w:ascii="Microsoft YaHei" w:hAnsi="Microsoft YaHei" w:eastAsia="微软雅黑"/>
-          <w:sz w:val="22"/>
-        </w:rPr>
-        <w:t>官方片段长4.5秒，本地片段25帧、20fps，单次播放1.25秒。演示中的末尾回到首帧来自循环播放。接下来通过合成数据、真实视频评价和效率测量说明整体结果。</w:t>
-      </w:r>
-    </w:p>
-    <w:p>
-      <w:pPr>
-        <w:pStyle w:val="1"/>
-        <w:spacing w:before="200" w:after="160"/>
-      </w:pPr>
-      <w:r>
-        <w:rPr>
-          <w:sz w:val="30"/>
-        </w:rPr>
-        <w:t>第4页  合成数据定量结果</w:t>
+        <w:t>第2页  合成数据定量结果</w:t>
       </w:r>
     </w:p>
     <w:p>
@@ -164,6 +84,7 @@
       </w:r>
     </w:p>
     <w:p>
+      <w:pPr/>
       <w:r>
         <w:br w:type="page"/>
       </w:r>
@@ -174,10 +95,7 @@
         <w:spacing w:before="200" w:after="160"/>
       </w:pPr>
       <w:r>
-        <w:rPr>
-          <w:sz w:val="30"/>
-        </w:rPr>
-        <w:t>第5页  真实视频主体边缘保留</w:t>
+        <w:t>第3页  真实视频主体边缘保留</w:t>
       </w:r>
     </w:p>
     <w:p>
@@ -197,11 +115,7 @@
         <w:spacing w:line="324" w:lineRule="auto" w:after="140"/>
       </w:pPr>
       <w:r>
-        <w:rPr>
-          <w:rFonts w:ascii="Microsoft YaHei" w:hAnsi="Microsoft YaHei" w:eastAsia="微软雅黑"/>
-          <w:sz w:val="22"/>
-        </w:rPr>
-        <w:t>DAVIS没有配对虚化真值，因此我们将边缘指标与原视频、局部放大及连续帧观察结合。MagicBokeh尚未加入这张真实视频表。DeepLens采用自身估深和原生默认光圈，各方法的控制适配沿用既定配置。</w:t>
+        <w:t>DAVIS没有配对虚化真值，因此我们将边缘指标与原视频、局部放大及连续帧观察结合。MagicBokeh已在表中留出一行，VEPI暂未测量，数值留空。补测先明确DAVIS的目标区域和选焦规则，再做小样本预检和50段统一评价。DeepLens采用自身估深和原生默认光圈，各方法的控制适配沿用既定配置。</w:t>
       </w:r>
     </w:p>
     <w:p>
@@ -210,10 +124,7 @@
         <w:spacing w:before="200" w:after="160"/>
       </w:pPr>
       <w:r>
-        <w:rPr>
-          <w:sz w:val="30"/>
-        </w:rPr>
-        <w:t>第6页  模型计算成本</w:t>
+        <w:t>第4页  模型计算成本</w:t>
       </w:r>
     </w:p>
     <w:p>
@@ -241,6 +152,7 @@
       </w:r>
     </w:p>
     <w:p>
+      <w:pPr/>
       <w:r>
         <w:br w:type="page"/>
       </w:r>
@@ -251,10 +163,7 @@
         <w:spacing w:before="200" w:after="160"/>
       </w:pPr>
       <w:r>
-        <w:rPr>
-          <w:sz w:val="30"/>
-        </w:rPr>
-        <w:t>第7页  给定输入下的视频处理效率</w:t>
+        <w:t>第5页  给定输入下的视频处理效率</w:t>
       </w:r>
     </w:p>
     <w:p>
@@ -287,10 +196,7 @@
         <w:spacing w:before="200" w:after="160"/>
       </w:pPr>
       <w:r>
-        <w:rPr>
-          <w:sz w:val="30"/>
-        </w:rPr>
-        <w:t>第8页  ATB用时集中在编码与解码</w:t>
+        <w:t>第6页  ATB用时集中在编码与解码</w:t>
       </w:r>
     </w:p>
     <w:p>
@@ -318,6 +224,7 @@
       </w:r>
     </w:p>
     <w:p>
+      <w:pPr/>
       <w:r>
         <w:br w:type="page"/>
       </w:r>
@@ -328,10 +235,7 @@
         <w:spacing w:before="200" w:after="160"/>
       </w:pPr>
       <w:r>
-        <w:rPr>
-          <w:sz w:val="30"/>
-        </w:rPr>
-        <w:t>第9页  优化冗余计算</w:t>
+        <w:t>第7页  优化冗余计算</w:t>
       </w:r>
     </w:p>
     <w:p>
@@ -376,46 +280,107 @@
         <w:spacing w:before="200" w:after="160"/>
       </w:pPr>
       <w:r>
-        <w:rPr>
-          <w:sz w:val="30"/>
-        </w:rPr>
-        <w:t>第10页  细绳两时刻的输入离焦变化</w:t>
-      </w:r>
-    </w:p>
-    <w:p>
-      <w:pPr>
-        <w:spacing w:line="324" w:lineRule="auto" w:after="140"/>
-      </w:pPr>
-      <w:r>
-        <w:rPr>
-          <w:rFonts w:ascii="Microsoft YaHei" w:hAnsi="Microsoft YaHei" w:eastAsia="微软雅黑"/>
-          <w:sz w:val="22"/>
-        </w:rPr>
-        <w:t>car-turn片段中，已记录的端点观察是第22帧细绳比第1帧更淡、更模糊。输入诊断先在RGB中定位局部候选，再读取预测视差和焦点。R1、R2、R4在两个时刻都有有效对应，其名义离焦量分别由0.708、1.022、1.398增至2.403、2.027、2.843。</w:t>
-      </w:r>
-    </w:p>
-    <w:p>
-      <w:pPr>
-        <w:spacing w:line="324" w:lineRule="auto" w:after="140"/>
-      </w:pPr>
-      <w:r>
-        <w:rPr>
-          <w:rFonts w:ascii="Microsoft YaHei" w:hAnsi="Microsoft YaHei" w:eastAsia="微软雅黑"/>
-          <w:sz w:val="22"/>
-        </w:rPr>
-        <w:t>名义离焦量按K乘以预测视差与焦点之差的绝对值计算，是输入控制诊断量。焦点从0.32269变化到0.41688，也参与了局部离焦变化。当前三个候选窄带都呈现端点升高，支持继续检查输入控制与输出现象的关系。</w:t>
-      </w:r>
-    </w:p>
-    <w:p>
-      <w:pPr>
-        <w:spacing w:line="324" w:lineRule="auto" w:after="140"/>
-      </w:pPr>
-      <w:r>
-        <w:rPr>
-          <w:rFonts w:ascii="Microsoft YaHei" w:hAnsi="Microsoft YaHei" w:eastAsia="微软雅黑"/>
-          <w:sz w:val="22"/>
-        </w:rPr>
-        <w:t>细绳与草地混合是一个待验证假设。定位窄带含混合像素，局部视差相关性随位置变化；后续先核对原RGB清晰度及对应位置，再讨论局部控制干预。两时刻对照与整个序列变化分开分析。</w:t>
+        <w:t>第8页  同一段细绳，后面变得更模糊</w:t>
+      </w:r>
+    </w:p>
+    <w:p>
+      <w:pPr>
+        <w:spacing w:line="324" w:lineRule="auto" w:after="140"/>
+      </w:pPr>
+      <w:r>
+        <w:t>这里看蓝圈里的同一段栏杆。第1帧还能比较清楚地看到细绳，到第22帧，细绳变淡、边缘也更软。表里列出三个位置：后面的输入虚化强度都更大。现在先把这个变化记下来，再核对每个采样点是否一直落在绳子上。</w:t>
+      </w:r>
+    </w:p>
+    <w:p>
+      <w:pPr>
+        <w:spacing w:line="324" w:lineRule="auto" w:after="140"/>
+      </w:pPr>
+      <w:r>
+        <w:t>讲解补充：表中的“输入虚化强度”对应记录里的名义离焦量，计算方式是 K×|预测视差−焦点|。数值越大，输入要求的虚化越强。实际输出的模糊半径没有在这里测量。位置1、2、4对应R1、R2、R4，使用各窄带的中位数；R3第22帧定位失败，未列入。</w:t>
+      </w:r>
+    </w:p>
+    <w:p>
+      <w:pPr>
+        <w:spacing w:line="324" w:lineRule="auto" w:after="140"/>
+      </w:pPr>
+      <w:r>
+        <w:t>待补：同一局部绳段的定位确认、原视频清晰度对照，以及细绳和草地的视差关系。两帧焦点分别为0.32269、0.41688；共享焦点变化会影响细绳和草地的离焦曲线。窄带可能含草地，当前仍保留“深度混入背景”这一待验证解释。</w:t>
+      </w:r>
+    </w:p>
+    <w:p>
+      <w:pPr>
+        <w:spacing w:before="200" w:after="160"/>
+      </w:pPr>
+      <w:r>
+        <w:t>图源：用户标注的/root/autodl-tmp/00001.png和00022.png。两图统一裁剪(x=484,y=212,w=540,h=270)，未锐化或调整颜色。数值见records/any2bokeh-B33-B36-diagnostics-20261014-B33-input-statistics.json。</w:t>
+      </w:r>
+    </w:p>
+    <w:p>
+      <w:pPr>
+        <w:pStyle w:val="1"/>
+        <w:spacing w:line="324" w:lineRule="auto" w:after="140"/>
+      </w:pPr>
+      <w:r>
+        <w:t>第9页  鸭头比身体更模糊</w:t>
+      </w:r>
+    </w:p>
+    <w:p>
+      <w:pPr>
+        <w:spacing w:line="324" w:lineRule="auto" w:after="140"/>
+      </w:pPr>
+      <w:r>
+        <w:t>这页把原视频和ATB结果放在一起，再放大同一处鸭头。我们之前看到鸭头变软，而身体保留得相对清楚。第0帧的输入虚化强度，头部是2.400，颈部0.204，身体0.580，输入给头部的虚化强度明显更大。</w:t>
+      </w:r>
+    </w:p>
+    <w:p>
+      <w:pPr>
+        <w:spacing w:line="324" w:lineRule="auto" w:after="140"/>
+      </w:pPr>
+      <w:r>
+        <w:t>讲解补充：表格与上一页使用同一个输入公式，取各区域的中位数。鸭头的预测视差比焦点更大，所查水面的视差则更小；这一例先检查头颈深度和选焦关系。头部、颈部的真实深度尚无真值。</w:t>
+      </w:r>
+    </w:p>
+    <w:p>
+      <w:pPr/>
+      <w:r>
+        <w:t>待补：六种方法的同位置结果已经准备，用户观看完成后，再补哪些方法保留鸭头更好、背景虚化有什么差别。第12、18帧喙框分别含约29%和42%的标注背景，解释这些框的统计时需单独注意。</w:t>
+      </w:r>
+    </w:p>
+    <w:p>
+      <w:pPr>
+        <w:spacing w:before="200" w:after="160"/>
+      </w:pPr>
+      <w:r>
+        <w:t>图源：B36 mallard-water第0帧Input_RGB和Frozen_ATB原PNG，头部局部统一裁剪(610,130,180,120)，保留相同比例。统计见records/any2bokeh-B33-B36-diagnostics-20261014-B36-input-statistics.json。</w:t>
+      </w:r>
+    </w:p>
+    <w:p>
+      <w:pPr>
+        <w:pStyle w:val="1"/>
+        <w:spacing w:line="324" w:lineRule="auto" w:after="140"/>
+      </w:pPr>
+      <w:r>
+        <w:t>第10页  不同方法的伞绳效果</w:t>
+      </w:r>
+    </w:p>
+    <w:p>
+      <w:pPr>
+        <w:spacing w:line="324" w:lineRule="auto" w:after="140"/>
+      </w:pPr>
+      <w:r>
+        <w:t>这里是第0帧同一处伞绳，放在一起看六种方法。之前用户按编号观看时，认为P04的绳子最清楚，之后核对P04就是ATB。这个案例既保留了细绳仍有损失的观察，也保留了ATB比其他方法做得更好的结果。</w:t>
+      </w:r>
+    </w:p>
+    <w:p>
+      <w:pPr/>
+      <w:r>
+        <w:t>讲解补充：此次反馈针对第0帧这块区域。DeepLens使用自身估深，其余方法的内部控制也各有设置。后续讨论共同问题时，需要把输入差异一起考虑。</w:t>
+      </w:r>
+    </w:p>
+    <w:p>
+      <w:pPr/>
+      <w:r>
+        <w:t>图源：B19 paragliding-launch第0帧原输入与六方法冻结预测，统一裁剪(348,19,248,144)。人工反馈保存在records/any2bokeh-failure-analysis-20261009-human-review.json。待补事项保留在讲稿中，幻灯片不预填后续结论。</w:t>
       </w:r>
     </w:p>
     <w:p>
@@ -424,99 +389,7 @@
         <w:spacing w:before="200" w:after="160"/>
       </w:pPr>
       <w:r>
-        <w:rPr>
-          <w:sz w:val="30"/>
-        </w:rPr>
-        <w:t>第11页  鸭头与身体的离焦分配</w:t>
-      </w:r>
-    </w:p>
-    <w:p>
-      <w:pPr>
-        <w:spacing w:line="324" w:lineRule="auto" w:after="140"/>
-      </w:pPr>
-      <w:r>
-        <w:rPr>
-          <w:rFonts w:ascii="Microsoft YaHei" w:hAnsi="Microsoft YaHei" w:eastAsia="微软雅黑"/>
-          <w:sz w:val="22"/>
-        </w:rPr>
-        <w:t>mallard-water片段中，人工观看提出鸭头疑似变软。第0帧输入控制统计显示：头部名义离焦中位数2.400，颈部0.204，身体0.580。头部获得了更大的离焦控制，这是当前明确的输入现象。</w:t>
-      </w:r>
-    </w:p>
-    <w:p>
-      <w:pPr>
-        <w:spacing w:line="324" w:lineRule="auto" w:after="140"/>
-      </w:pPr>
-      <w:r>
-        <w:rPr>
-          <w:rFonts w:ascii="Microsoft YaHei" w:hAnsi="Microsoft YaHei" w:eastAsia="微软雅黑"/>
-          <w:sz w:val="22"/>
-        </w:rPr>
-        <w:t>0、6、12、18、24五个关键帧都已经完成局部输入统计和同位置六方法材料准备。下一步结合图像观察头部清晰度、与身体的差别，以及背景虚化强度，判断各方法如何响应这些输入。</w:t>
-      </w:r>
-    </w:p>
-    <w:p>
-      <w:pPr>
-        <w:spacing w:line="324" w:lineRule="auto" w:after="140"/>
-      </w:pPr>
-      <w:r>
-        <w:rPr>
-          <w:rFonts w:ascii="Microsoft YaHei" w:hAnsi="Microsoft YaHei" w:eastAsia="微软雅黑"/>
-          <w:sz w:val="22"/>
-        </w:rPr>
-        <w:t>目前六方法的新视觉复核等待完成，真实深度亦未获得。所查头部视差与水面不同，因此这一例需要独立检查头颈的视差、目标焦点及各方法控制适配。</w:t>
-      </w:r>
-    </w:p>
-    <w:p>
-      <w:r>
-        <w:br w:type="page"/>
-      </w:r>
-    </w:p>
-    <w:p>
-      <w:pPr>
-        <w:pStyle w:val="1"/>
-        <w:spacing w:before="200" w:after="160"/>
-      </w:pPr>
-      <w:r>
-        <w:rPr>
-          <w:sz w:val="30"/>
-        </w:rPr>
-        <w:t>第12页  伞绳的跨方法细节保留</w:t>
-      </w:r>
-    </w:p>
-    <w:p>
-      <w:pPr>
-        <w:spacing w:line="324" w:lineRule="auto" w:after="140"/>
-      </w:pPr>
-      <w:r>
-        <w:rPr>
-          <w:rFonts w:ascii="Microsoft YaHei" w:hAnsi="Microsoft YaHei" w:eastAsia="微软雅黑"/>
-          <w:sz w:val="22"/>
-        </w:rPr>
-        <w:t>B19的第0帧上方伞绳已有人工跨方法反馈：P04相对更清楚，映射核对后P04为ATB。这个结果帮助我们同时看到细节损失和ATB相对其他方法的优势。</w:t>
-      </w:r>
-    </w:p>
-    <w:p>
-      <w:pPr>
-        <w:spacing w:line="324" w:lineRule="auto" w:after="140"/>
-      </w:pPr>
-      <w:r>
-        <w:rPr>
-          <w:rFonts w:ascii="Microsoft YaHei" w:hAnsi="Microsoft YaHei" w:eastAsia="微软雅黑"/>
-          <w:sz w:val="22"/>
-        </w:rPr>
-        <w:t>后续保持同帧、同区域、同尺度展示ATB与固定参照方法。不同方法的内部深度和离焦适配各有设置，结合这些条件理解观察结果。该反馈的覆盖范围是已观看的第0帧对照，其他时刻继续通过已有视频材料核查。</w:t>
-      </w:r>
-    </w:p>
-    <w:p>
-      <w:pPr>
-        <w:pStyle w:val="1"/>
-        <w:spacing w:before="200" w:after="160"/>
-      </w:pPr>
-      <w:r>
-        <w:rPr>
-          <w:sz w:val="30"/>
-        </w:rPr>
-        <w:t>第13页  接下来做什么</w:t>
+        <w:t>第11页  接下来做什么</w:t>
       </w:r>
     </w:p>
     <w:p>

</xml_diff>

<commit_message>
baseline: complete approved MagicBokeh DAVIS VEPI and fill 1016 report
</commit_message>
<xml_diff>
--- a/汇报/2026-10-16_基线更新与ATB分析/基线更新与ATB分析_1016_讲稿.docx
+++ b/汇报/2026-10-16_基线更新与ATB分析/基线更新与ATB分析_1016_讲稿.docx
@@ -23,7 +23,7 @@
           <w:rFonts w:ascii="Microsoft YaHei" w:hAnsi="Microsoft YaHei" w:eastAsia="微软雅黑"/>
           <w:sz w:val="22"/>
         </w:rPr>
-        <w:t>汇报日期为2026年10月16日，实验和案例依据截至10月14日。本次承接9月30日汇报，重点讲新增MagicBokeh参照、统一硬件的成本分析、已经验证的ATB实现优化，以及真实视频局部问题的定位。</w:t>
+        <w:t>汇报日期为2026年10月16日，ATB实验和案例依据截至10月14日；MagicBokeh DAVIS补测单列2026年10月15日运行记录。本次承接9月30日汇报，重点讲新增MagicBokeh参照、统一硬件的成本分析、已经验证的ATB实现优化，以及真实视频局部问题的定位。</w:t>
       </w:r>
     </w:p>
     <w:p>
@@ -107,15 +107,15 @@
           <w:rFonts w:ascii="Microsoft YaHei" w:hAnsi="Microsoft YaHei" w:eastAsia="微软雅黑"/>
           <w:sz w:val="22"/>
         </w:rPr>
-        <w:t>DAVIS评价包含50段真实视频，每段25帧，共六种方法。VEPI关注主体边缘保留，数值越高表示该指标下的边缘保留越好。BokehMe为0.954，ATB为0.950，二者较接近。</w:t>
-      </w:r>
-    </w:p>
-    <w:p>
-      <w:pPr>
-        <w:spacing w:line="324" w:lineRule="auto" w:after="140"/>
-      </w:pPr>
-      <w:r>
-        <w:t>DAVIS没有配对虚化真值，因此我们将边缘指标与原视频、局部放大及连续帧观察结合。MagicBokeh已在表中留出一行，VEPI暂未测量，数值留空。补测先明确DAVIS的目标区域和选焦规则，再做小样本预检和50段统一评价。DeepLens采用自身估深和原生默认光圈，各方法的控制适配沿用既定配置。</w:t>
+        <w:t>DAVIS评价包含50段真实视频，每段25帧，现补齐七种方法。MagicBokeh的MP4主VEPI为0.66962，PNG诊断为0.66919，编码差值为+0.00043；预检8段200帧复用后只补42段。原六方法不重跑：BokehMe为0.954，ATB为0.950。VEPI关注主体边缘保留，不能单独排名整体虚化或时序质量。</w:t>
+      </w:r>
+    </w:p>
+    <w:p>
+      <w:pPr>
+        <w:spacing w:line="324" w:lineRule="auto" w:after="140"/>
+      </w:pPr>
+      <w:r>
+        <w:t>DAVIS没有配对虚化真值，因此我们将边缘指标与原视频、局部放大及连续帧观察结合。MagicBokeh补测：50段×25帧，1024×576，VEPI-public-mp4=0.66962104；PNG诊断=0.66918814；MP4−PNG=+0.00043290。DAVIS原类别ID!=0合并目标（沿用旧口径含ID255），最近邻缩放后采用B最大8连通域、预测PNG8深度中位数最近像素选点。焦点取自身DAdepth选点深度，不取VDA数值；标注只在生成器外辅助一个点，不输入GT mask/alpha。多实例可能选中不同组件，不保证所有实例同焦。K16，原控制公式abs(d-focus)*K/32、0.1阈值、FP16六图块及PIL/AdaIN均不变。预检8段后复用200帧，只补42段；seed=42+25*固定scene索引+帧号。VEPI沿旧Sobel/ROI、H.264 quality8/20fps/yuv420p与先帧均值后视频等权均值；不代表整体虚化质量。只完成量化/程序核验，未新增人工视觉结论或复核组失败发现。 DeepLens仍采用自身估深和原生默认光圈，原六方法输入适配及旧数值均保留。</w:t>
       </w:r>
     </w:p>
     <w:p>

</xml_diff>

<commit_message>
report: explain three MagicBokeh methods with original paper figures
</commit_message>
<xml_diff>
--- a/汇报/2026-10-16_基线更新与ATB分析/基线更新与ATB分析_1016_讲稿.docx
+++ b/汇报/2026-10-16_基线更新与ATB分析/基线更新与ATB分析_1016_讲稿.docx
@@ -386,10 +386,88 @@
     <w:p>
       <w:pPr>
         <w:pStyle w:val="1"/>
+      </w:pPr>
+      <w:r>
+        <w:t>第11页  MagicBokeh：用清晰图指导深度学习</w:t>
+      </w:r>
+    </w:p>
+    <w:p>
+      <w:pPr/>
+      <w:r>
+        <w:t>MagicBokeh先让深度模型适应低质量照片。训练时，同一场景的清晰图交给教师，加入模糊、噪声等退化后的图交给学生。学生既学习教师的内部特征，也学习最终深度图。使用时运行训练好的学生。</w:t>
+      </w:r>
+    </w:p>
+    <w:p>
+      <w:pPr/>
+      <w:r>
+        <w:t>教师与学生均采用Depth Anything v2 Large，相同初始化；这里主要学习抗退化能力，而非把模型压小。论文附录使用SA-1B中20万张样本和Real-ESRGAN退化流程。图s1标出特征损失Lf与输出LMSE，具体特征损失形式和权重需再核对实现。教师预测是伪标签，可靠教师的选择是我们局部修正方向的前置问题。</w:t>
+      </w:r>
+    </w:p>
+    <w:p>
+      <w:pPr/>
+      <w:r>
+        <w:t>图源：01_文献/MagicBokeh-CVPR2026.pdf，arXiv v2第9页图s1，§3.4与附录A。裁剪原图并等比放大。我们的启发是先获取可靠几何参考，再训练小型局部修正模块；候选方案见02_方案设计/蒸馏辅助的视频局部深度修正-候选思路.md。</w:t>
+      </w:r>
+    </w:p>
+    <w:p>
+      <w:pPr>
+        <w:pStyle w:val="1"/>
+      </w:pPr>
+      <w:r>
+        <w:t>第12页  MagicBokeh：清晰和模糊区域分开处理</w:t>
+      </w:r>
+    </w:p>
+    <w:p>
+      <w:pPr/>
+      <w:r>
+        <w:t>模型处理一个位置时，会参考其他位置的特征。MagicBokeh先根据对焦状态把图像分成两类，再让清晰区主要参考清晰区，模糊区主要参考模糊区，减少两类处理互相干扰。原图右侧矩阵里的叉号就是被抑制的跨区域联系。</w:t>
+      </w:r>
+    </w:p>
+    <w:p>
+      <w:pPr/>
+      <w:r>
+        <w:t>这里的模块叫Focus-aware Mask Attention。论文按两个位置是否属于同类构造注意力偏置：同类为0，异类为负无穷；本地官方代码使用-100近似强抑制。它约束自注意力，其他卷积等信息交互仍存在。类别取决于对焦状态，不是语义前景/背景；如果输入已经把细绳判入模糊区，需先检查这一步划分。视频还要检查区域类别是否跨帧跳变，以及缩小到特征网格后细结构是否保留。</w:t>
+      </w:r>
+    </w:p>
+    <w:p>
+      <w:pPr/>
+      <w:r>
+        <w:t>图源：同一PDF第4页图3右上C区域，§3.3与公式2/3；本地MagicBokeh/magicbokeh.py中的mask构造。底部对项目的启发仍是候选研究方向。</w:t>
+      </w:r>
+    </w:p>
+    <w:p>
+      <w:pPr>
+        <w:pStyle w:val="1"/>
+      </w:pPr>
+      <w:r>
+        <w:t>第13页  MagicBokeh：恢复与虚化交替训练</w:t>
+      </w:r>
+    </w:p>
+    <w:p>
+      <w:pPr/>
+      <w:r>
+        <w:t>细节恢复希望把纹理变清楚，虚化任务又要让部分区域变模糊。作者先训练恢复能力，再交替训练两项任务：学习虚化时保留恢复参数，学习恢复时主要更新恢复相关参数。这样把两项能力的更新分开。</w:t>
+      </w:r>
+    </w:p>
+    <w:p>
+      <w:pPr/>
+      <w:r>
+        <w:t>初始恢复预训练包括VAE编码器与UNet中的LoRA。后续虚化阶段更新ControlNet和Bokeh LoRA；恢复阶段只更新UNet的SR LoRA，并把离焦图和注意力屏蔽偏置设为0。固定参数仍参与前向计算，只是不更新。论文没有在该段给出精确切换频率，不在讲解中补造训练日程。LoRA是少量附加调整参数，ControlNet提供条件控制。</w:t>
+      </w:r>
+    </w:p>
+    <w:p>
+      <w:pPr/>
+      <w:r>
+        <w:t>图源：同一PDF第4页图3整体及§3.2。对我们的启发是先固定VDA和ATB、单独验证局部修正模块；蒸馏决定参考什么，交替训练决定何时更新哪些参数，两者是不同设计。</w:t>
+      </w:r>
+    </w:p>
+    <w:p>
+      <w:pPr>
+        <w:pStyle w:val="1"/>
         <w:spacing w:before="200" w:after="160"/>
       </w:pPr>
       <w:r>
-        <w:t>第11页  接下来做什么</w:t>
+        <w:t>第14页  接下来做什么</w:t>
       </w:r>
     </w:p>
     <w:p>

</xml_diff>

<commit_message>
report: update cases with B33 focus analysis and B36 local correction
</commit_message>
<xml_diff>
--- a/汇报/2026-10-16_基线更新与ATB分析/基线更新与ATB分析_1016_讲稿.docx
+++ b/汇报/2026-10-16_基线更新与ATB分析/基线更新与ATB分析_1016_讲稿.docx
@@ -280,31 +280,31 @@
         <w:spacing w:before="200" w:after="160"/>
       </w:pPr>
       <w:r>
-        <w:t>第8页  同一段细绳，后面变得更模糊</w:t>
-      </w:r>
-    </w:p>
-    <w:p>
-      <w:pPr>
-        <w:spacing w:line="324" w:lineRule="auto" w:after="140"/>
-      </w:pPr>
-      <w:r>
-        <w:t>这里看蓝圈里的同一段栏杆。第1帧还能比较清楚地看到细绳，到第22帧，细绳变淡、边缘也更软。表里列出三个位置：后面的输入虚化强度都更大。现在先把这个变化记下来，再核对每个采样点是否一直落在绳子上。</w:t>
-      </w:r>
-    </w:p>
-    <w:p>
-      <w:pPr>
-        <w:spacing w:line="324" w:lineRule="auto" w:after="140"/>
-      </w:pPr>
-      <w:r>
-        <w:t>讲解补充：表中的“输入虚化强度”对应记录里的名义离焦量，计算方式是 K×|预测视差−焦点|。数值越大，输入要求的虚化越强。实际输出的模糊半径没有在这里测量。位置1、2、4对应R1、R2、R4，使用各窄带的中位数；R3第22帧定位失败，未列入。</w:t>
-      </w:r>
-    </w:p>
-    <w:p>
-      <w:pPr>
-        <w:spacing w:line="324" w:lineRule="auto" w:after="140"/>
-      </w:pPr>
-      <w:r>
-        <w:t>待补：同一局部绳段的定位确认、原视频清晰度对照，以及细绳和草地的视差关系。两帧焦点分别为0.32269、0.41688；共享焦点变化会影响细绳和草地的离焦曲线。窄带可能含草地，当前仍保留“深度混入背景”这一待验证解释。</w:t>
+        <w:t>第8页  跟焦让细绳的输入虚化强度增大</w:t>
+      </w:r>
+    </w:p>
+    <w:p>
+      <w:pPr>
+        <w:spacing w:line="324" w:lineRule="auto" w:after="140"/>
+      </w:pPr>
+      <w:r>
+        <w:t>蓝圈里同一段细绳，第22帧比第1帧更模糊；用户确认对应原图的清晰程度相近。最新检查把输入虚化强度的变化拆成焦点变化和视差变化两部分。三个位置里，主要增量来自跟随汽车变化的焦点，位置2和4的视差变化反而抵消了一部分增长。</w:t>
+      </w:r>
+    </w:p>
+    <w:p>
+      <w:pPr>
+        <w:spacing w:line="324" w:lineRule="auto" w:after="140"/>
+      </w:pPr>
+      <w:r>
+        <w:t>表中使用窄带平均K×|d−focus|，与上一版中位数表整组替换。位置1/2/4：0.576→2.106、0.782→2.051、1.349→2.635；焦点贡献+1.313/+1.423/+1.507，视差贡献+0.217/−0.154/−0.220。两因素对称分解分别平均两种改变顺序的边际差异，未舍入数值精确加和。这里“深度”口头简称实际预测视差，贡献是输入公式变化的数值分解。</w:t>
+      </w:r>
+    </w:p>
+    <w:p>
+      <w:pPr>
+        <w:spacing w:line="324" w:lineRule="auto" w:after="140"/>
+      </w:pPr>
+      <w:r>
+        <w:t>细绳横截面有小幅独立视差轮廓，局部值仍可能有偏差。已按两端立柱参考只改帧22的3原像素窄带，780像素；R2相对原版变化MAE仅0.051，同幅度草地对照0.065，全图最大变化1灰度级。窄带参考未显著恢复这次输出，新输出视觉验收待用户。另把focus固定为帧1值时，绳附近纹理响应更大，汽车梯度能量比却从0.769降到0.433。后续分别研究局部几何参考、空间支持和跟焦影响，不把固定早期焦点作为修正方案。</w:t>
       </w:r>
     </w:p>
     <w:p>
@@ -312,7 +312,7 @@
         <w:spacing w:before="200" w:after="160"/>
       </w:pPr>
       <w:r>
-        <w:t>图源：用户标注的/root/autodl-tmp/00001.png和00022.png。两图统一裁剪(x=484,y=212,w=540,h=270)，未锐化或调整颜色。数值见records/any2bokeh-B33-B36-diagnostics-20261014-B33-input-statistics.json。</w:t>
+        <w:t>数据来源：records/any2bokeh-B33-geometry-diagnosis-20261015.json及any2bokeh-B33-causal-diagnosis-20261015.json。两帧图仍用用户标注的00001.png/00022.png，原图清晰度反馈见human-review记录。真实轴向距离、跨来源与时序质量尚待验证。</w:t>
       </w:r>
     </w:p>
     <w:p>
@@ -321,29 +321,29 @@
         <w:spacing w:line="324" w:lineRule="auto" w:after="140"/>
       </w:pPr>
       <w:r>
-        <w:t>第9页  鸭头比身体更模糊</w:t>
-      </w:r>
-    </w:p>
-    <w:p>
-      <w:pPr>
-        <w:spacing w:line="324" w:lineRule="auto" w:after="140"/>
-      </w:pPr>
-      <w:r>
-        <w:t>这页把原视频和ATB结果放在一起，再放大同一处鸭头。我们之前看到鸭头变软，而身体保留得相对清楚。第0帧的输入虚化强度，头部是2.400，颈部0.204，身体0.580，输入给头部的虚化强度明显更大。</w:t>
-      </w:r>
-    </w:p>
-    <w:p>
-      <w:pPr>
-        <w:spacing w:line="324" w:lineRule="auto" w:after="140"/>
-      </w:pPr>
-      <w:r>
-        <w:t>讲解补充：表格与上一页使用同一个输入公式，取各区域的中位数。鸭头的预测视差比焦点更大，所查水面的视差则更小；这一例先检查头颈深度和选焦关系。头部、颈部的真实深度尚无真值。</w:t>
+        <w:t>第9页  调整鸭头深度后，细节更清楚</w:t>
+      </w:r>
+    </w:p>
+    <w:p>
+      <w:pPr>
+        <w:spacing w:line="324" w:lineRule="auto" w:after="140"/>
+      </w:pPr>
+      <w:r>
+        <w:t>这次固定模型、原图、焦点和K，只把鸭头局部的预测视差改成原颈部区域的代表值。图中从左到右是原视频、本机重放的原版ATB、局部调整后的结果。用户已确认局部调整这一组效果最好。当前主要诊断是鸭头局部深度偏差造成过大的离焦，局部调整改善了这个案例。</w:t>
+      </w:r>
+    </w:p>
+    <w:p>
+      <w:pPr>
+        <w:spacing w:line="324" w:lineRule="auto" w:after="140"/>
+      </w:pPr>
+      <w:r>
+        <w:t>表中“头部与原图的差异”是RGB8 MAE，单位0–255灰度级；“头部边缘强度比”是梯度能量比，原图为1。原版为7.417/0.429，头部调整为2.575/0.836；同像素数、同signed-q变化移到水面的对照为7.413/0.429。两个数值描述固定ROI的结构与像素响应，视觉偏好来自用户。</w:t>
       </w:r>
     </w:p>
     <w:p>
       <w:pPr/>
       <w:r>
-        <w:t>待补：六种方法的同位置结果已经准备，用户观看完成后，再补哪些方法保留鸭头更好、背景虚化有什么差别。第12、18帧喙框分别含约29%和42%的标注背景，解释这些框的统计时需单独注意。</w:t>
+        <w:t>颈部参考q=147，focus=0.57550、K16固定，CoC和MPI一致重建。只干预源帧0，所有条件仍运行完整25帧；同机原版重复逐字节一致，各条件结束RNG一致。旧正式PNG与本机重放有最大1灰度级差异，所以图表使用本机配对原版。身体和邻近水面有少量变化，单帧影响传播到帧1–7；这次没有做全时序或跨来源改善验证。颈部值是诊断参考，不是真实鸭头几何测量。</w:t>
       </w:r>
     </w:p>
     <w:p>
@@ -351,7 +351,15 @@
         <w:spacing w:before="200" w:after="160"/>
       </w:pPr>
       <w:r>
-        <w:t>图源：B36 mallard-water第0帧Input_RGB和Frozen_ATB原PNG，头部局部统一裁剪(610,130,180,120)，保留相同比例。统计见records/any2bokeh-B33-B36-diagnostics-20261014-B36-input-statistics.json。</w:t>
+        <w:t>用户此前偏好BokehDiff鸭头与整体效果，同时认为其整体背景虚化偏弱；此处头部几何修正来自本案例输入诊断，不是MagicBokeh方法。下一步固定参考来源与区域规则，再讨论跨帧/跨来源受控验证。</w:t>
+      </w:r>
+    </w:p>
+    <w:p>
+      <w:pPr>
+        <w:spacing w:line="324" w:lineRule="auto" w:after="140"/>
+      </w:pPr>
+      <w:r>
+        <w:t>图源：outputs/any2bokeh-failure-analysis-20261009/B36-causal-diagnosis-20261015中的Input/native/head_to_neck-1024.png，统一裁剪(610,130,180,120)。数据及用户偏好见records/any2bokeh-B36-causal-diagnosis-20261015.json与CSV。</w:t>
       </w:r>
     </w:p>
     <w:p>
@@ -360,27 +368,25 @@
         <w:spacing w:line="324" w:lineRule="auto" w:after="140"/>
       </w:pPr>
       <w:r>
-        <w:t>第10页  不同方法的伞绳效果</w:t>
-      </w:r>
-    </w:p>
-    <w:p>
-      <w:pPr>
-        <w:spacing w:line="324" w:lineRule="auto" w:after="140"/>
-      </w:pPr>
-      <w:r>
-        <w:t>这里是第0帧同一处伞绳，放在一起看六种方法。之前用户按编号观看时，认为P04的绳子最清楚，之后核对P04就是ATB。这个案例既保留了细绳仍有损失的观察，也保留了ATB比其他方法做得更好的结果。</w:t>
+        <w:t>第10页  伞绳：ATB 相对保留了更多细节</w:t>
       </w:r>
     </w:p>
     <w:p>
       <w:pPr/>
       <w:r>
-        <w:t>讲解补充：此次反馈针对第0帧这块区域。DeepLens使用自身估深，其余方法的内部控制也各有设置。后续讨论共同问题时，需要把输入差异一起考虑。</w:t>
+        <w:t>保留第0帧同区域六方法对照。用户在揭示编号前认为P04最清楚，核对后对应ATB；用户也观察到ATB的上方细绳仍有模糊。这个案例帮助我们同时保留局部细节问题和ATB相对其他方法的优势。</w:t>
       </w:r>
     </w:p>
     <w:p>
       <w:pPr/>
       <w:r>
-        <w:t>图源：B19 paragliding-launch第0帧原输入与六方法冻结预测，统一裁剪(348,19,248,144)。人工反馈保存在records/any2bokeh-failure-analysis-20261009-human-review.json。待补事项保留在讲稿中，幻灯片不预填后续结论。</w:t>
+        <w:t>目前主要证据仍是这处用户对照与输入视差检查。B19没有新增几何修正实验，不把B36的干预结果直接套到伞绳上。DeepLens用自身估深，其余方法内部条件适配也不同。反馈针对第0帧上方ROI，不登记为全序列排名。</w:t>
+      </w:r>
+    </w:p>
+    <w:p>
+      <w:pPr/>
+      <w:r>
+        <w:t>图源与位置保持不变：paragliding-launch第0帧输入及六方法原预测，ROI(348,19,248,144)。详细反馈见records/any2bokeh-failure-analysis-20261009-human-review.json。</w:t>
       </w:r>
     </w:p>
     <w:p>

</xml_diff>

<commit_message>
report: present ATB cases as visual problems and move detail to script
</commit_message>
<xml_diff>
--- a/汇报/2026-10-16_基线更新与ATB分析/基线更新与ATB分析_1016_讲稿.docx
+++ b/汇报/2026-10-16_基线更新与ATB分析/基线更新与ATB分析_1016_讲稿.docx
@@ -280,31 +280,31 @@
         <w:spacing w:before="200" w:after="160"/>
       </w:pPr>
       <w:r>
-        <w:t>第8页  跟焦让细绳的输入虚化强度增大</w:t>
-      </w:r>
-    </w:p>
-    <w:p>
-      <w:pPr>
-        <w:spacing w:line="324" w:lineRule="auto" w:after="140"/>
-      </w:pPr>
-      <w:r>
-        <w:t>蓝圈里同一段细绳，第22帧比第1帧更模糊；用户确认对应原图的清晰程度相近。最新检查把输入虚化强度的变化拆成焦点变化和视差变化两部分。三个位置里，主要增量来自跟随汽车变化的焦点，位置2和4的视差变化反而抵消了一部分增长。</w:t>
-      </w:r>
-    </w:p>
-    <w:p>
-      <w:pPr>
-        <w:spacing w:line="324" w:lineRule="auto" w:after="140"/>
-      </w:pPr>
-      <w:r>
-        <w:t>表中使用窄带平均K×|d−focus|，与上一版中位数表整组替换。位置1/2/4：0.576→2.106、0.782→2.051、1.349→2.635；焦点贡献+1.313/+1.423/+1.507，视差贡献+0.217/−0.154/−0.220。两因素对称分解分别平均两种改变顺序的边际差异，未舍入数值精确加和。这里“深度”口头简称实际预测视差，贡献是输入公式变化的数值分解。</w:t>
-      </w:r>
-    </w:p>
-    <w:p>
-      <w:pPr>
-        <w:spacing w:line="324" w:lineRule="auto" w:after="140"/>
-      </w:pPr>
-      <w:r>
-        <w:t>细绳横截面有小幅独立视差轮廓，局部值仍可能有偏差。已按两端立柱参考只改帧22的3原像素窄带，780像素；R2相对原版变化MAE仅0.051，同幅度草地对照0.065，全图最大变化1灰度级。窄带参考未显著恢复这次输出，新输出视觉验收待用户。另把focus固定为帧1值时，绳附近纹理响应更大，汽车梯度能量比却从0.769降到0.433。后续分别研究局部几何参考、空间支持和跟焦影响，不把固定早期焦点作为修正方案。</w:t>
+        <w:t>第8页  细绳：局部几何偏差可能被跟焦放大</w:t>
+      </w:r>
+    </w:p>
+    <w:p>
+      <w:pPr>
+        <w:spacing w:line="324" w:lineRule="auto" w:after="140"/>
+      </w:pPr>
+      <w:r>
+        <w:t>这一页先看问题现象。两张图是同一段路边细绳的第1帧和第22帧。用户确认原视频的清晰度基本相近，但ATB输出里的细绳在第22帧更模糊。我们关注的是细结构的几何输入是否合理，以及它在跟焦过程中怎样影响最终虚化。</w:t>
+      </w:r>
+    </w:p>
+    <w:p>
+      <w:pPr>
+        <w:spacing w:line="324" w:lineRule="auto" w:after="140"/>
+      </w:pPr>
+      <w:r>
+        <w:t>输入检查发现，细绳具有小幅独立视差轮廓，所以不能说模型完全没有识别到它。部分绳段的预测视差仍接近背景草地，与相邻立柱存在差异，提示数值可能不准确。汽车靠近时焦点随汽车移动，原来较小的离焦差距被放大。三个已定位局部的离焦增长主要由焦点变化驱动，部分局部的视差变化反而抵消了一些增长。因此当前表述是“局部几何偏差可能被跟焦放大”。</w:t>
+      </w:r>
+    </w:p>
+    <w:p>
+      <w:pPr>
+        <w:spacing w:line="324" w:lineRule="auto" w:after="140"/>
+      </w:pPr>
+      <w:r>
+        <w:t>后台诊断记录保留数据，不放在PPT上：三个局部平均名义离焦为0.576→2.106、0.782→2.051、1.349→2.635。只按两端立柱参考修改第22帧的细绳窄带，输出变化很小；R2梯度能量比0.130→0.132，未取得鸭头案例那样的明显恢复。暂用第1帧focus时R2升到0.302，但汽车自身从0.769降到0.433。因此固定早期焦点不作为解决方案，细线条件的空间支持和背景上下文仍需进一步区分。</w:t>
       </w:r>
     </w:p>
     <w:p>
@@ -312,7 +312,7 @@
         <w:spacing w:before="200" w:after="160"/>
       </w:pPr>
       <w:r>
-        <w:t>数据来源：records/any2bokeh-B33-geometry-diagnosis-20261015.json及any2bokeh-B33-causal-diagnosis-20261015.json。两帧图仍用用户标注的00001.png/00022.png，原图清晰度反馈见human-review记录。真实轴向距离、跨来源与时序质量尚待验证。</w:t>
+        <w:t>证据入口：records/any2bokeh-B33-geometry-diagnosis-20261015.json及any2bokeh-B33-causal-diagnosis-20261015.json。图源保留用户标注的00001.png/00022.png。上述是预测视差和输入控制的诊断，局部立柱插值不是测量深度；新干预图未作用户视觉验收，不将其表述为已成功修复。</w:t>
       </w:r>
     </w:p>
     <w:p>
@@ -321,29 +321,29 @@
         <w:spacing w:line="324" w:lineRule="auto" w:after="140"/>
       </w:pPr>
       <w:r>
-        <w:t>第9页  调整鸭头深度后，细节更清楚</w:t>
-      </w:r>
-    </w:p>
-    <w:p>
-      <w:pPr>
-        <w:spacing w:line="324" w:lineRule="auto" w:after="140"/>
-      </w:pPr>
-      <w:r>
-        <w:t>这次固定模型、原图、焦点和K，只把鸭头局部的预测视差改成原颈部区域的代表值。图中从左到右是原视频、本机重放的原版ATB、局部调整后的结果。用户已确认局部调整这一组效果最好。当前主要诊断是鸭头局部深度偏差造成过大的离焦，局部调整改善了这个案例。</w:t>
-      </w:r>
-    </w:p>
-    <w:p>
-      <w:pPr>
-        <w:spacing w:line="324" w:lineRule="auto" w:after="140"/>
-      </w:pPr>
-      <w:r>
-        <w:t>表中“头部与原图的差异”是RGB8 MAE，单位0–255灰度级；“头部边缘强度比”是梯度能量比，原图为1。原版为7.417/0.429，头部调整为2.575/0.836；同像素数、同signed-q变化移到水面的对照为7.413/0.429。两个数值描述固定ROI的结构与像素响应，视觉偏好来自用户。</w:t>
+        <w:t>第9页  鸭头：深度估计偏差会影响最终虚化</w:t>
+      </w:r>
+    </w:p>
+    <w:p>
+      <w:pPr>
+        <w:spacing w:line="324" w:lineRule="auto" w:after="140"/>
+      </w:pPr>
+      <w:r>
+        <w:t>上方三张图从左到右是原视频、原版ATB、只调整鸭头局部深度后的结果。原版中鸭头被过度虚化；把鸭头预测视差调整到原颈部的代表值，同时保持原图、焦点、K和模型不变，头部细节更清楚，用户也认为这一组整体效果最好。这个案例说明，局部深度估计偏差会传递到最终虚化结果，改善几何输入可以改善观感。</w:t>
+      </w:r>
+    </w:p>
+    <w:p>
+      <w:pPr>
+        <w:spacing w:line="324" w:lineRule="auto" w:after="140"/>
+      </w:pPr>
+      <w:r>
+        <w:t>这是有对照的局部干预。原版重放与重复运行在本机输出逐字节一致；相同面积、相同视差改变量施加到邻近水面时，鸭头几乎不变。后台数值为：头部与原图的RGB8 MAE从7.417降至2.575，梯度能量比从0.429升至0.836；水面对照为7.413/0.429。这些数字只衡量结构和像素响应，视觉改善结论另有用户反馈支持，不把梯度比当作感知准确率。</w:t>
       </w:r>
     </w:p>
     <w:p>
       <w:pPr/>
       <w:r>
-        <w:t>颈部参考q=147，focus=0.57550、K16固定，CoC和MPI一致重建。只干预源帧0，所有条件仍运行完整25帧；同机原版重复逐字节一致，各条件结束RNG一致。旧正式PNG与本机重放有最大1灰度级差异，所以图表使用本机配对原版。身体和邻近水面有少量变化，单帧影响传播到帧1–7；这次没有做全时序或跨来源改善验证。颈部值是诊断参考，不是真实鸭头几何测量。</w:t>
+        <w:t>采用的案例主诊断是：鸭头局部深度估计偏差造成过大的离焦，局部修正改善了结果。颈部参考q=147，原focus=0.57550、K16固定，CoC和MPI随新视差一致重建。只干预源帧0，完整25帧时序调用保留；身体及邻近水面仍有少量变化，不宣称无旁效应。颈部值是有效的诊断参考，并非精确真实鸭头深度，也尚未证明跨帧、跨来源都有效。</w:t>
       </w:r>
     </w:p>
     <w:p>
@@ -351,15 +351,15 @@
         <w:spacing w:before="200" w:after="160"/>
       </w:pPr>
       <w:r>
-        <w:t>用户此前偏好BokehDiff鸭头与整体效果，同时认为其整体背景虚化偏弱；此处头部几何修正来自本案例输入诊断，不是MagicBokeh方法。下一步固定参考来源与区域规则，再讨论跨帧/跨来源受控验证。</w:t>
-      </w:r>
-    </w:p>
-    <w:p>
-      <w:pPr>
-        <w:spacing w:line="324" w:lineRule="auto" w:after="140"/>
-      </w:pPr>
-      <w:r>
-        <w:t>图源：outputs/any2bokeh-failure-analysis-20261009/B36-causal-diagnosis-20261015中的Input/native/head_to_neck-1024.png，统一裁剪(610,130,180,120)。数据及用户偏好见records/any2bokeh-B36-causal-diagnosis-20261015.json与CSV。</w:t>
+        <w:t>跨方法观察中，ATB、MPIB、BokehMe和Dr.Bokeh都出现鸭头模糊；用户偏好BokehDiff的整体效果，同时认为其背景虚化较弱。局部头部修正源自本案例几何诊断，没有采用MagicBokeh生成器或选焦方法。后续考虑自动判断和修正不可靠局部几何，但本页不把诊断操作包装成已完成的新方法。</w:t>
+      </w:r>
+    </w:p>
+    <w:p>
+      <w:pPr>
+        <w:spacing w:line="324" w:lineRule="auto" w:after="140"/>
+      </w:pPr>
+      <w:r>
+        <w:t>图源：outputs/any2bokeh-failure-analysis-20261009/B36-causal-diagnosis-20261015中的Input/native/head_to_neck-1024.png，三图统一裁剪(610,130,180,120)。配对结果与用户反馈见records/any2bokeh-B36-causal-diagnosis-20261015.json及human-review.json。</w:t>
       </w:r>
     </w:p>
     <w:p>
@@ -368,25 +368,25 @@
         <w:spacing w:line="324" w:lineRule="auto" w:after="140"/>
       </w:pPr>
       <w:r>
-        <w:t>第10页  伞绳：ATB 相对保留了更多细节</w:t>
+        <w:t>第10页  伞绳：细结构深度偏差可能导致误虚化</w:t>
       </w:r>
     </w:p>
     <w:p>
       <w:pPr/>
       <w:r>
-        <w:t>保留第0帧同区域六方法对照。用户在揭示编号前认为P04最清楚，核对后对应ATB；用户也观察到ATB的上方细绳仍有模糊。这个案例帮助我们同时保留局部细节问题和ATB相对其他方法的优势。</w:t>
+        <w:t>这页展示伞绳这一细结构问题。用户观察到人物头顶多根绳子基本全程模糊；在第0帧同位置方法对照中，用户认为ATB相对最清楚，其他方法模糊更明显。因此我们同时保留两点：细绳仍有细节损失，以及ATB在此处相对其他方法具有优势。</w:t>
       </w:r>
     </w:p>
     <w:p>
       <w:pPr/>
       <w:r>
-        <w:t>目前主要证据仍是这处用户对照与输入视差检查。B19没有新增几何修正实验，不把B36的干预结果直接套到伞绳上。DeepLens用自身估深，其余方法内部条件适配也不同。反馈针对第0帧上方ROI，不登记为全序列排名。</w:t>
+        <w:t>伞绳很细，预测几何对其轮廓、边界混合像素和深度数值的表达可能不准确，从而影响最终虚化。输入检查已提供这方面线索，但B19尚未做局部几何修正实验，所以PPT使用“可能导致”的表述，不把鸭头已经得到的干预结果直接套到伞绳上。DeepLens采用自身估深，其余方法的内部适配也不同；方法对照不等于唯一原因证明。</w:t>
       </w:r>
     </w:p>
     <w:p>
       <w:pPr/>
       <w:r>
-        <w:t>图源与位置保持不变：paragliding-launch第0帧输入及六方法原预测，ROI(348,19,248,144)。详细反馈见records/any2bokeh-failure-analysis-20261009-human-review.json。</w:t>
+        <w:t>图源保持不变：paragliding-launch第0帧原视频及六方法原预测，同一ROI(348,19,248,144)。方法映射及用户原话见records/any2bokeh-failure-analysis-20261009-human-review.json。本页用于说明细结构几何与细节保留这一候选问题，不报告全序列排名或新数值结果。</w:t>
       </w:r>
     </w:p>
     <w:p>

</xml_diff>

<commit_message>
report: simplify three ATB case slides to images and one sentence
</commit_message>
<xml_diff>
--- a/汇报/2026-10-16_基线更新与ATB分析/基线更新与ATB分析_1016_讲稿.docx
+++ b/汇报/2026-10-16_基线更新与ATB分析/基线更新与ATB分析_1016_讲稿.docx
@@ -280,7 +280,7 @@
         <w:spacing w:before="200" w:after="160"/>
       </w:pPr>
       <w:r>
-        <w:t>第8页  细绳：局部几何偏差可能被跟焦放大</w:t>
+        <w:t>第8页  细绳在跟焦过程中变模糊</w:t>
       </w:r>
     </w:p>
     <w:p>
@@ -321,7 +321,7 @@
         <w:spacing w:line="324" w:lineRule="auto" w:after="140"/>
       </w:pPr>
       <w:r>
-        <w:t>第9页  鸭头：深度估计偏差会影响最终虚化</w:t>
+        <w:t>第9页  鸭头局部深度调整前后</w:t>
       </w:r>
     </w:p>
     <w:p>
@@ -368,7 +368,7 @@
         <w:spacing w:line="324" w:lineRule="auto" w:after="140"/>
       </w:pPr>
       <w:r>
-        <w:t>第10页  伞绳：细结构深度偏差可能导致误虚化</w:t>
+        <w:t>第10页  伞绳等细结构的虚化问题</w:t>
       </w:r>
     </w:p>
     <w:p>

</xml_diff>